<commit_message>
tenn sup ct: answering latex, amicus docx (docx_bias 0.2), PDR docx (0.25), reply and PFR latex gated on the model at HEAD; PDR latex, reply and PFR docx, motion latex still reported (fb-595.54.54)
The petition-for-review INPUT loses a doubled note mark ("197. 5[^5]") and six URLs split by the
filed PDF's line wraps. Remaining blockers: TeX's underfull URL-only line, xeschola's bold test,
the parenthesis width before an em dash, Word's Schola ligatures, LibreOffice's note placement
(docs/open-items/fb-595.54.54.md, third pass) (fb-595.54.54)

Co-Authored-By: Claude Opus 5.5 <noreply@anthropic.com>
</commit_message>
<xml_diff>
--- a/courts/sixth-circuit/tennessee/state/supreme-court/amicus-brief/usage/OUTPUT-amicus-brief.docx
+++ b/courts/sixth-circuit/tennessee/state/supreme-court/amicus-brief/usage/OUTPUT-amicus-brief.docx
@@ -65,7 +65,7 @@
     </w:p>
     <w:tbl>
       <w:tblPr>
-        <w:tblW w:w="9360" w:type="dxa"/>
+        <w:tblW w:w="9356" w:type="dxa"/>
         <w:tblLayout w:type="fixed"/>
         <w:tblCellMar>
           <w:top w:w="0" w:type="dxa"/>
@@ -77,7 +77,7 @@
       </w:tblPr>
       <w:tblGrid>
         <w:gridCol w:w="4320"/>
-        <w:gridCol w:w="5040"/>
+        <w:gridCol w:w="5036"/>
       </w:tblGrid>
       <w:tr>
         <w:trPr>
@@ -158,7 +158,7 @@
         </w:tc>
         <w:tc>
           <w:tcPr>
-            <w:tcW w:w="5040" w:type="dxa"/>
+            <w:tcW w:w="5036" w:type="dxa"/>
             <w:tcMar>
               <w:left w:w="144" w:type="dxa"/>
             </w:tcMar>
@@ -857,7 +857,7 @@
       <w:pPr>
         <w:keepLines/>
         <w:tabs>
-          <w:tab w:val="right" w:leader="dot" w:pos="9360"/>
+          <w:tab w:val="right" w:leader="dot" w:pos="9356"/>
         </w:tabs>
         <w:spacing w:before="140" w:after="0" w:line="336" w:lineRule="exact"/>
         <w:ind w:left="0" w:right="720" w:firstLine="0"/>
@@ -903,7 +903,7 @@
       <w:pPr>
         <w:keepLines/>
         <w:tabs>
-          <w:tab w:val="right" w:leader="dot" w:pos="9360"/>
+          <w:tab w:val="right" w:leader="dot" w:pos="9356"/>
         </w:tabs>
         <w:spacing w:before="140" w:after="0" w:line="336" w:lineRule="exact"/>
         <w:ind w:left="0" w:right="720" w:firstLine="0"/>
@@ -955,7 +955,7 @@
       <w:pPr>
         <w:keepLines/>
         <w:tabs>
-          <w:tab w:val="right" w:leader="dot" w:pos="9360"/>
+          <w:tab w:val="right" w:leader="dot" w:pos="9356"/>
         </w:tabs>
         <w:spacing w:before="140" w:after="0" w:line="336" w:lineRule="exact"/>
         <w:ind w:left="0" w:right="720" w:firstLine="0"/>
@@ -983,7 +983,7 @@
       <w:pPr>
         <w:keepLines/>
         <w:tabs>
-          <w:tab w:val="right" w:leader="dot" w:pos="9360"/>
+          <w:tab w:val="right" w:leader="dot" w:pos="9356"/>
         </w:tabs>
         <w:spacing w:before="140" w:after="0" w:line="336" w:lineRule="exact"/>
         <w:ind w:left="0" w:right="720" w:firstLine="0"/>
@@ -1005,7 +1005,7 @@
       <w:pPr>
         <w:keepLines/>
         <w:tabs>
-          <w:tab w:val="right" w:leader="dot" w:pos="9360"/>
+          <w:tab w:val="right" w:leader="dot" w:pos="9356"/>
         </w:tabs>
         <w:spacing w:before="140" w:after="0" w:line="336" w:lineRule="exact"/>
         <w:ind w:left="1440" w:right="720" w:hanging="720"/>
@@ -1033,7 +1033,7 @@
       <w:pPr>
         <w:keepLines/>
         <w:tabs>
-          <w:tab w:val="right" w:leader="dot" w:pos="9360"/>
+          <w:tab w:val="right" w:leader="dot" w:pos="9356"/>
         </w:tabs>
         <w:spacing w:before="140" w:after="0" w:line="336" w:lineRule="exact"/>
         <w:ind w:left="1440" w:right="720" w:hanging="720"/>
@@ -1121,7 +1121,7 @@
       <w:pPr>
         <w:keepLines/>
         <w:tabs>
-          <w:tab w:val="right" w:leader="dot" w:pos="9360"/>
+          <w:tab w:val="right" w:leader="dot" w:pos="9356"/>
         </w:tabs>
         <w:spacing w:before="140" w:after="0" w:line="336" w:lineRule="exact"/>
         <w:ind w:left="1440" w:right="720" w:hanging="720"/>
@@ -1245,7 +1245,7 @@
       <w:pPr>
         <w:keepLines/>
         <w:tabs>
-          <w:tab w:val="right" w:leader="dot" w:pos="9360"/>
+          <w:tab w:val="right" w:leader="dot" w:pos="9356"/>
         </w:tabs>
         <w:spacing w:before="140" w:after="0" w:line="336" w:lineRule="exact"/>
         <w:ind w:left="2160" w:right="720" w:hanging="720"/>
@@ -1363,7 +1363,7 @@
       <w:pPr>
         <w:keepLines/>
         <w:tabs>
-          <w:tab w:val="right" w:leader="dot" w:pos="9360"/>
+          <w:tab w:val="right" w:leader="dot" w:pos="9356"/>
         </w:tabs>
         <w:spacing w:before="140" w:after="0" w:line="336" w:lineRule="exact"/>
         <w:ind w:left="2160" w:right="720" w:hanging="720"/>
@@ -1451,7 +1451,7 @@
       <w:pPr>
         <w:keepLines/>
         <w:tabs>
-          <w:tab w:val="right" w:leader="dot" w:pos="9360"/>
+          <w:tab w:val="right" w:leader="dot" w:pos="9356"/>
         </w:tabs>
         <w:spacing w:before="140" w:after="0" w:line="336" w:lineRule="exact"/>
         <w:ind w:left="0" w:right="720" w:firstLine="0"/>
@@ -2810,7 +2810,7 @@
     </w:p>
     <w:tbl>
       <w:tblPr>
-        <w:tblW w:w="9360" w:type="dxa"/>
+        <w:tblW w:w="9356" w:type="dxa"/>
         <w:tblLayout w:type="fixed"/>
         <w:tblCellMar>
           <w:top w:w="0" w:type="dxa"/>
@@ -2821,7 +2821,7 @@
         <w:tblLook w:val="0000" w:firstRow="0" w:lastRow="0" w:firstColumn="0" w:lastColumn="0" w:noHBand="0" w:noVBand="0"/>
       </w:tblPr>
       <w:tblGrid>
-        <w:gridCol w:w="9360"/>
+        <w:gridCol w:w="9356"/>
       </w:tblGrid>
       <w:tr>
         <w:trPr>
@@ -2829,7 +2829,7 @@
         </w:trPr>
         <w:tc>
           <w:tcPr>
-            <w:tcW w:w="9360" w:type="dxa"/>
+            <w:tcW w:w="9356" w:type="dxa"/>
           </w:tcPr>
           <w:p>
             <w:pPr>
@@ -3597,7 +3597,7 @@
     </w:p>
     <w:tbl>
       <w:tblPr>
-        <w:tblW w:w="9360" w:type="dxa"/>
+        <w:tblW w:w="9356" w:type="dxa"/>
         <w:tblLayout w:type="fixed"/>
         <w:tblCellMar>
           <w:top w:w="0" w:type="dxa"/>
@@ -3608,7 +3608,7 @@
         <w:tblLook w:val="0000" w:firstRow="0" w:lastRow="0" w:firstColumn="0" w:lastColumn="0" w:noHBand="0" w:noVBand="0"/>
       </w:tblPr>
       <w:tblGrid>
-        <w:gridCol w:w="9360"/>
+        <w:gridCol w:w="9356"/>
       </w:tblGrid>
       <w:tr>
         <w:trPr>
@@ -3616,7 +3616,7 @@
         </w:trPr>
         <w:tc>
           <w:tcPr>
-            <w:tcW w:w="9360" w:type="dxa"/>
+            <w:tcW w:w="9356" w:type="dxa"/>
           </w:tcPr>
           <w:p>
             <w:pPr>
@@ -3792,7 +3792,7 @@
     </w:p>
     <w:tbl>
       <w:tblPr>
-        <w:tblW w:w="9360" w:type="dxa"/>
+        <w:tblW w:w="9356" w:type="dxa"/>
         <w:tblLayout w:type="fixed"/>
         <w:tblCellMar>
           <w:top w:w="0" w:type="dxa"/>
@@ -3803,7 +3803,7 @@
         <w:tblLook w:val="0000" w:firstRow="0" w:lastRow="0" w:firstColumn="0" w:lastColumn="0" w:noHBand="0" w:noVBand="0"/>
       </w:tblPr>
       <w:tblGrid>
-        <w:gridCol w:w="9360"/>
+        <w:gridCol w:w="9356"/>
       </w:tblGrid>
       <w:tr>
         <w:trPr>
@@ -3811,7 +3811,7 @@
         </w:trPr>
         <w:tc>
           <w:tcPr>
-            <w:tcW w:w="9360" w:type="dxa"/>
+            <w:tcW w:w="9356" w:type="dxa"/>
           </w:tcPr>
           <w:p>
             <w:pPr>
@@ -3957,7 +3957,7 @@
     </w:p>
     <w:tbl>
       <w:tblPr>
-        <w:tblW w:w="9360" w:type="dxa"/>
+        <w:tblW w:w="9356" w:type="dxa"/>
         <w:tblLayout w:type="fixed"/>
         <w:tblCellMar>
           <w:top w:w="0" w:type="dxa"/>
@@ -3968,7 +3968,7 @@
         <w:tblLook w:val="0000" w:firstRow="0" w:lastRow="0" w:firstColumn="0" w:lastColumn="0" w:noHBand="0" w:noVBand="0"/>
       </w:tblPr>
       <w:tblGrid>
-        <w:gridCol w:w="9360"/>
+        <w:gridCol w:w="9356"/>
       </w:tblGrid>
       <w:tr>
         <w:trPr>
@@ -3976,7 +3976,7 @@
         </w:trPr>
         <w:tc>
           <w:tcPr>
-            <w:tcW w:w="9360" w:type="dxa"/>
+            <w:tcW w:w="9356" w:type="dxa"/>
           </w:tcPr>
           <w:p>
             <w:pPr>
@@ -4122,7 +4122,7 @@
     </w:p>
     <w:tbl>
       <w:tblPr>
-        <w:tblW w:w="9360" w:type="dxa"/>
+        <w:tblW w:w="9356" w:type="dxa"/>
         <w:tblLayout w:type="fixed"/>
         <w:tblCellMar>
           <w:top w:w="0" w:type="dxa"/>
@@ -4133,7 +4133,7 @@
         <w:tblLook w:val="0000" w:firstRow="0" w:lastRow="0" w:firstColumn="0" w:lastColumn="0" w:noHBand="0" w:noVBand="0"/>
       </w:tblPr>
       <w:tblGrid>
-        <w:gridCol w:w="9360"/>
+        <w:gridCol w:w="9356"/>
       </w:tblGrid>
       <w:tr>
         <w:trPr>
@@ -4141,7 +4141,7 @@
         </w:trPr>
         <w:tc>
           <w:tcPr>
-            <w:tcW w:w="9360" w:type="dxa"/>
+            <w:tcW w:w="9356" w:type="dxa"/>
           </w:tcPr>
           <w:p>
             <w:pPr>
@@ -4221,7 +4221,7 @@
     </w:p>
     <w:tbl>
       <w:tblPr>
-        <w:tblW w:w="9360" w:type="dxa"/>
+        <w:tblW w:w="9356" w:type="dxa"/>
         <w:tblLayout w:type="fixed"/>
         <w:tblCellMar>
           <w:top w:w="0" w:type="dxa"/>
@@ -4232,7 +4232,7 @@
         <w:tblLook w:val="0000" w:firstRow="0" w:lastRow="0" w:firstColumn="0" w:lastColumn="0" w:noHBand="0" w:noVBand="0"/>
       </w:tblPr>
       <w:tblGrid>
-        <w:gridCol w:w="9360"/>
+        <w:gridCol w:w="9356"/>
       </w:tblGrid>
       <w:tr>
         <w:trPr>
@@ -4240,7 +4240,7 @@
         </w:trPr>
         <w:tc>
           <w:tcPr>
-            <w:tcW w:w="9360" w:type="dxa"/>
+            <w:tcW w:w="9356" w:type="dxa"/>
           </w:tcPr>
           <w:p>
             <w:pPr>
@@ -4370,7 +4370,7 @@
     </w:p>
     <w:tbl>
       <w:tblPr>
-        <w:tblW w:w="9360" w:type="dxa"/>
+        <w:tblW w:w="9356" w:type="dxa"/>
         <w:tblLayout w:type="fixed"/>
         <w:tblCellMar>
           <w:top w:w="0" w:type="dxa"/>
@@ -4381,7 +4381,7 @@
         <w:tblLook w:val="0000" w:firstRow="0" w:lastRow="0" w:firstColumn="0" w:lastColumn="0" w:noHBand="0" w:noVBand="0"/>
       </w:tblPr>
       <w:tblGrid>
-        <w:gridCol w:w="9360"/>
+        <w:gridCol w:w="9356"/>
       </w:tblGrid>
       <w:tr>
         <w:trPr>
@@ -4389,7 +4389,7 @@
         </w:trPr>
         <w:tc>
           <w:tcPr>
-            <w:tcW w:w="9360" w:type="dxa"/>
+            <w:tcW w:w="9356" w:type="dxa"/>
           </w:tcPr>
           <w:p>
             <w:pPr>
@@ -4955,7 +4955,7 @@
     </w:p>
     <w:tbl>
       <w:tblPr>
-        <w:tblW w:w="9360" w:type="dxa"/>
+        <w:tblW w:w="9356" w:type="dxa"/>
         <w:tblLayout w:type="fixed"/>
         <w:tblCellMar>
           <w:top w:w="0" w:type="dxa"/>
@@ -4966,7 +4966,7 @@
         <w:tblLook w:val="0000" w:firstRow="0" w:lastRow="0" w:firstColumn="0" w:lastColumn="0" w:noHBand="0" w:noVBand="0"/>
       </w:tblPr>
       <w:tblGrid>
-        <w:gridCol w:w="9360"/>
+        <w:gridCol w:w="9356"/>
       </w:tblGrid>
       <w:tr>
         <w:trPr>
@@ -4974,7 +4974,7 @@
         </w:trPr>
         <w:tc>
           <w:tcPr>
-            <w:tcW w:w="9360" w:type="dxa"/>
+            <w:tcW w:w="9356" w:type="dxa"/>
           </w:tcPr>
           <w:p>
             <w:pPr>
@@ -5225,7 +5225,7 @@
       <w:footerReference w:type="default" r:id="rIdXdPage"/>
       <w:footerReference w:type="first" r:id="rIdXdNone"/>
       <w:pgSz w:w="12240" w:h="15840"/>
-      <w:pgMar w:top="1440" w:right="1440" w:bottom="1440" w:left="1440" w:header="720" w:footer="672" w:gutter="0"/>
+      <w:pgMar w:top="1440" w:right="1444" w:bottom="1440" w:left="1440" w:header="720" w:footer="672" w:gutter="0"/>
       <w:titlePg/>
     </w:sectPr>
   </w:body>

</xml_diff>